<commit_message>
Sync from private source SHA: a2246aa34ae437900e5d0230ff7645118825feed
</commit_message>
<xml_diff>
--- a/Docs/01Foundation/Normal Distribution.docx
+++ b/Docs/01Foundation/Normal Distribution.docx
@@ -4870,6 +4870,17 @@
       </w:pPr>
       <w:r>
         <w:rPr>
+          <w:rFonts w:hint="default" w:asciiTheme="minorEastAsia" w:hAnsiTheme="minorEastAsia" w:cstheme="minorEastAsia"/>
+          <w:i w:val="0"/>
+          <w:iCs w:val="0"/>
+          <w:sz w:val="24"/>
+          <w:szCs w:val="24"/>
+          <w:lang w:val="en-US"/>
+        </w:rPr>
+        <w:t xml:space="preserve">1.1 Data: </w:t>
+      </w:r>
+      <w:r>
+        <w:rPr>
           <w:rFonts w:hint="eastAsia" w:asciiTheme="minorEastAsia" w:hAnsiTheme="minorEastAsia" w:eastAsiaTheme="minorEastAsia" w:cstheme="minorEastAsia"/>
           <w:i w:val="0"/>
           <w:iCs w:val="0"/>
@@ -5020,423 +5031,542 @@
         </w:rPr>
         <w:t xml:space="preserve"> ; </w:t>
       </w:r>
-      <m:oMath>
-        <m:acc>
-          <m:accPr>
-            <m:chr m:val="̅"/>
-            <m:ctrlPr>
-              <w:rPr>
-                <w:rFonts w:hint="eastAsia" w:ascii="DejaVu Math TeX Gyre" w:hAnsi="DejaVu Math TeX Gyre" w:eastAsiaTheme="minorEastAsia" w:cstheme="minorEastAsia"/>
-                <w:i/>
-                <w:iCs w:val="0"/>
-                <w:sz w:val="24"/>
-                <w:szCs w:val="24"/>
-                <w:vertAlign w:val="baseline"/>
-                <w:lang w:val="en-US"/>
-              </w:rPr>
-            </m:ctrlPr>
-          </m:accPr>
-          <m:e>
-            <m:r>
-              <m:rPr/>
-              <w:rPr>
-                <w:rFonts w:hint="eastAsia" w:ascii="DejaVu Math TeX Gyre" w:hAnsi="DejaVu Math TeX Gyre" w:eastAsiaTheme="minorEastAsia" w:cstheme="minorEastAsia"/>
-                <w:sz w:val="24"/>
-                <w:szCs w:val="24"/>
-                <w:vertAlign w:val="baseline"/>
-                <w:lang w:val="en-US"/>
-              </w:rPr>
-              <m:t>x</m:t>
-            </m:r>
-            <m:ctrlPr>
-              <w:rPr>
-                <w:rFonts w:hint="eastAsia" w:ascii="DejaVu Math TeX Gyre" w:hAnsi="DejaVu Math TeX Gyre" w:eastAsiaTheme="minorEastAsia" w:cstheme="minorEastAsia"/>
-                <w:i/>
-                <w:iCs w:val="0"/>
-                <w:sz w:val="24"/>
-                <w:szCs w:val="24"/>
-                <w:vertAlign w:val="baseline"/>
-                <w:lang w:val="en-US"/>
-              </w:rPr>
-            </m:ctrlPr>
-          </m:e>
-        </m:acc>
-        <m:r>
-          <m:rPr/>
-          <w:rPr>
-            <w:rFonts w:hint="eastAsia" w:ascii="DejaVu Math TeX Gyre" w:hAnsi="DejaVu Math TeX Gyre" w:eastAsiaTheme="minorEastAsia" w:cstheme="minorEastAsia"/>
-            <w:sz w:val="24"/>
-            <w:szCs w:val="24"/>
-            <w:vertAlign w:val="baseline"/>
-            <w:lang w:val="en-US"/>
-          </w:rPr>
-          <m:t>=</m:t>
-        </m:r>
-        <m:f>
-          <m:fPr>
-            <m:ctrlPr>
-              <m:rPr/>
-              <w:rPr>
-                <w:rFonts w:hint="eastAsia" w:ascii="DejaVu Math TeX Gyre" w:hAnsi="DejaVu Math TeX Gyre" w:eastAsiaTheme="minorEastAsia" w:cstheme="minorEastAsia"/>
-                <w:i/>
-                <w:iCs w:val="0"/>
-                <w:sz w:val="24"/>
-                <w:szCs w:val="24"/>
-                <w:vertAlign w:val="baseline"/>
-                <w:lang w:val="en-US"/>
-              </w:rPr>
-            </m:ctrlPr>
-          </m:fPr>
-          <m:num>
-            <m:sSub>
-              <m:sSubPr>
-                <m:ctrlPr>
-                  <m:rPr/>
-                  <w:rPr>
-                    <w:rFonts w:hint="eastAsia" w:ascii="DejaVu Math TeX Gyre" w:hAnsi="DejaVu Math TeX Gyre" w:eastAsiaTheme="minorEastAsia" w:cstheme="minorEastAsia"/>
-                    <w:i/>
-                    <w:iCs w:val="0"/>
-                    <w:sz w:val="24"/>
-                    <w:szCs w:val="24"/>
-                    <w:vertAlign w:val="baseline"/>
-                    <w:lang w:val="en-US"/>
-                  </w:rPr>
-                </m:ctrlPr>
-              </m:sSubPr>
-              <m:e>
-                <m:r>
-                  <m:rPr/>
-                  <w:rPr>
-                    <w:rFonts w:hint="eastAsia" w:ascii="DejaVu Math TeX Gyre" w:hAnsi="DejaVu Math TeX Gyre" w:eastAsiaTheme="minorEastAsia" w:cstheme="minorEastAsia"/>
-                    <w:sz w:val="24"/>
-                    <w:szCs w:val="24"/>
-                    <w:vertAlign w:val="baseline"/>
-                    <w:lang w:val="en-US"/>
-                  </w:rPr>
-                  <m:t>x</m:t>
-                </m:r>
-                <m:ctrlPr>
-                  <m:rPr/>
-                  <w:rPr>
-                    <w:rFonts w:hint="eastAsia" w:ascii="DejaVu Math TeX Gyre" w:hAnsi="DejaVu Math TeX Gyre" w:eastAsiaTheme="minorEastAsia" w:cstheme="minorEastAsia"/>
-                    <w:i/>
-                    <w:iCs w:val="0"/>
-                    <w:sz w:val="24"/>
-                    <w:szCs w:val="24"/>
-                    <w:vertAlign w:val="baseline"/>
-                    <w:lang w:val="en-US"/>
-                  </w:rPr>
-                </m:ctrlPr>
-              </m:e>
-              <m:sub>
-                <m:r>
-                  <m:rPr/>
-                  <w:rPr>
-                    <w:rFonts w:hint="eastAsia" w:ascii="DejaVu Math TeX Gyre" w:hAnsi="DejaVu Math TeX Gyre" w:eastAsiaTheme="minorEastAsia" w:cstheme="minorEastAsia"/>
-                    <w:sz w:val="24"/>
-                    <w:szCs w:val="24"/>
-                    <w:vertAlign w:val="baseline"/>
-                    <w:lang w:val="en-US"/>
-                  </w:rPr>
-                  <m:t>1</m:t>
-                </m:r>
-                <m:ctrlPr>
-                  <m:rPr/>
-                  <w:rPr>
-                    <w:rFonts w:hint="eastAsia" w:ascii="DejaVu Math TeX Gyre" w:hAnsi="DejaVu Math TeX Gyre" w:eastAsiaTheme="minorEastAsia" w:cstheme="minorEastAsia"/>
-                    <w:i/>
-                    <w:iCs w:val="0"/>
-                    <w:sz w:val="24"/>
-                    <w:szCs w:val="24"/>
-                    <w:vertAlign w:val="baseline"/>
-                    <w:lang w:val="en-US"/>
-                  </w:rPr>
-                </m:ctrlPr>
-              </m:sub>
-            </m:sSub>
-            <m:r>
-              <m:rPr/>
-              <w:rPr>
-                <w:rFonts w:hint="eastAsia" w:ascii="DejaVu Math TeX Gyre" w:hAnsi="DejaVu Math TeX Gyre" w:eastAsiaTheme="minorEastAsia" w:cstheme="minorEastAsia"/>
-                <w:sz w:val="24"/>
-                <w:szCs w:val="24"/>
-                <w:vertAlign w:val="baseline"/>
-                <w:lang w:val="en-US"/>
-              </w:rPr>
-              <m:t>+</m:t>
-            </m:r>
-            <m:sSub>
-              <m:sSubPr>
-                <m:ctrlPr>
-                  <m:rPr/>
-                  <w:rPr>
-                    <w:rFonts w:hint="eastAsia" w:ascii="DejaVu Math TeX Gyre" w:hAnsi="DejaVu Math TeX Gyre" w:eastAsiaTheme="minorEastAsia" w:cstheme="minorEastAsia"/>
-                    <w:i/>
-                    <w:iCs w:val="0"/>
-                    <w:sz w:val="24"/>
-                    <w:szCs w:val="24"/>
-                    <w:vertAlign w:val="baseline"/>
-                    <w:lang w:val="en-US"/>
-                  </w:rPr>
-                </m:ctrlPr>
-              </m:sSubPr>
-              <m:e>
-                <m:r>
-                  <m:rPr/>
-                  <w:rPr>
-                    <w:rFonts w:hint="eastAsia" w:ascii="DejaVu Math TeX Gyre" w:hAnsi="DejaVu Math TeX Gyre" w:eastAsiaTheme="minorEastAsia" w:cstheme="minorEastAsia"/>
-                    <w:sz w:val="24"/>
-                    <w:szCs w:val="24"/>
-                    <w:vertAlign w:val="baseline"/>
-                    <w:lang w:val="en-US"/>
-                  </w:rPr>
-                  <m:t>x</m:t>
-                </m:r>
-                <m:ctrlPr>
-                  <m:rPr/>
-                  <w:rPr>
-                    <w:rFonts w:hint="eastAsia" w:ascii="DejaVu Math TeX Gyre" w:hAnsi="DejaVu Math TeX Gyre" w:eastAsiaTheme="minorEastAsia" w:cstheme="minorEastAsia"/>
-                    <w:i/>
-                    <w:iCs w:val="0"/>
-                    <w:sz w:val="24"/>
-                    <w:szCs w:val="24"/>
-                    <w:vertAlign w:val="baseline"/>
-                    <w:lang w:val="en-US"/>
-                  </w:rPr>
-                </m:ctrlPr>
-              </m:e>
-              <m:sub>
-                <m:r>
-                  <m:rPr/>
-                  <w:rPr>
-                    <w:rFonts w:hint="eastAsia" w:ascii="DejaVu Math TeX Gyre" w:hAnsi="DejaVu Math TeX Gyre" w:eastAsiaTheme="minorEastAsia" w:cstheme="minorEastAsia"/>
-                    <w:sz w:val="24"/>
-                    <w:szCs w:val="24"/>
-                    <w:vertAlign w:val="baseline"/>
-                    <w:lang w:val="en-US"/>
-                  </w:rPr>
-                  <m:t>2</m:t>
-                </m:r>
-                <m:ctrlPr>
-                  <m:rPr/>
-                  <w:rPr>
-                    <w:rFonts w:hint="eastAsia" w:ascii="DejaVu Math TeX Gyre" w:hAnsi="DejaVu Math TeX Gyre" w:eastAsiaTheme="minorEastAsia" w:cstheme="minorEastAsia"/>
-                    <w:i/>
-                    <w:iCs w:val="0"/>
-                    <w:sz w:val="24"/>
-                    <w:szCs w:val="24"/>
-                    <w:vertAlign w:val="baseline"/>
-                    <w:lang w:val="en-US"/>
-                  </w:rPr>
-                </m:ctrlPr>
-              </m:sub>
-            </m:sSub>
-            <m:r>
-              <m:rPr/>
-              <w:rPr>
-                <w:rFonts w:hint="eastAsia" w:ascii="DejaVu Math TeX Gyre" w:hAnsi="DejaVu Math TeX Gyre" w:eastAsiaTheme="minorEastAsia" w:cstheme="minorEastAsia"/>
-                <w:sz w:val="24"/>
-                <w:szCs w:val="24"/>
-                <w:vertAlign w:val="baseline"/>
-                <w:lang w:val="en-US"/>
-              </w:rPr>
-              <m:t>+</m:t>
-            </m:r>
-            <m:sSub>
-              <m:sSubPr>
-                <m:ctrlPr>
-                  <m:rPr/>
-                  <w:rPr>
-                    <w:rFonts w:hint="eastAsia" w:ascii="DejaVu Math TeX Gyre" w:hAnsi="DejaVu Math TeX Gyre" w:eastAsiaTheme="minorEastAsia" w:cstheme="minorEastAsia"/>
-                    <w:i/>
-                    <w:iCs w:val="0"/>
-                    <w:sz w:val="24"/>
-                    <w:szCs w:val="24"/>
-                    <w:vertAlign w:val="baseline"/>
-                    <w:lang w:val="en-US"/>
-                  </w:rPr>
-                </m:ctrlPr>
-              </m:sSubPr>
-              <m:e>
-                <m:r>
-                  <m:rPr/>
-                  <w:rPr>
-                    <w:rFonts w:hint="eastAsia" w:ascii="DejaVu Math TeX Gyre" w:hAnsi="DejaVu Math TeX Gyre" w:eastAsiaTheme="minorEastAsia" w:cstheme="minorEastAsia"/>
-                    <w:sz w:val="24"/>
-                    <w:szCs w:val="24"/>
-                    <w:vertAlign w:val="baseline"/>
-                    <w:lang w:val="en-US"/>
-                  </w:rPr>
-                  <m:t>x</m:t>
-                </m:r>
-                <m:ctrlPr>
-                  <m:rPr/>
-                  <w:rPr>
-                    <w:rFonts w:hint="eastAsia" w:ascii="DejaVu Math TeX Gyre" w:hAnsi="DejaVu Math TeX Gyre" w:eastAsiaTheme="minorEastAsia" w:cstheme="minorEastAsia"/>
-                    <w:i/>
-                    <w:iCs w:val="0"/>
-                    <w:sz w:val="24"/>
-                    <w:szCs w:val="24"/>
-                    <w:vertAlign w:val="baseline"/>
-                    <w:lang w:val="en-US"/>
-                  </w:rPr>
-                </m:ctrlPr>
-              </m:e>
-              <m:sub>
-                <m:r>
-                  <m:rPr/>
-                  <w:rPr>
-                    <w:rFonts w:hint="eastAsia" w:ascii="DejaVu Math TeX Gyre" w:hAnsi="DejaVu Math TeX Gyre" w:eastAsiaTheme="minorEastAsia" w:cstheme="minorEastAsia"/>
-                    <w:sz w:val="24"/>
-                    <w:szCs w:val="24"/>
-                    <w:vertAlign w:val="baseline"/>
-                    <w:lang w:val="en-US"/>
-                  </w:rPr>
-                  <m:t>3</m:t>
-                </m:r>
-                <m:ctrlPr>
-                  <m:rPr/>
-                  <w:rPr>
-                    <w:rFonts w:hint="eastAsia" w:ascii="DejaVu Math TeX Gyre" w:hAnsi="DejaVu Math TeX Gyre" w:eastAsiaTheme="minorEastAsia" w:cstheme="minorEastAsia"/>
-                    <w:i/>
-                    <w:iCs w:val="0"/>
-                    <w:sz w:val="24"/>
-                    <w:szCs w:val="24"/>
-                    <w:vertAlign w:val="baseline"/>
-                    <w:lang w:val="en-US"/>
-                  </w:rPr>
-                </m:ctrlPr>
-              </m:sub>
-            </m:sSub>
-            <m:r>
-              <m:rPr/>
-              <w:rPr>
-                <w:rFonts w:hint="eastAsia" w:ascii="DejaVu Math TeX Gyre" w:hAnsi="DejaVu Math TeX Gyre" w:eastAsiaTheme="minorEastAsia" w:cstheme="minorEastAsia"/>
-                <w:sz w:val="24"/>
-                <w:szCs w:val="24"/>
-                <w:vertAlign w:val="baseline"/>
-                <w:lang w:val="en-US"/>
-              </w:rPr>
-              <m:t>+...+</m:t>
-            </m:r>
-            <m:sSub>
-              <m:sSubPr>
-                <m:ctrlPr>
-                  <m:rPr/>
-                  <w:rPr>
-                    <w:rFonts w:hint="eastAsia" w:ascii="DejaVu Math TeX Gyre" w:hAnsi="DejaVu Math TeX Gyre" w:eastAsiaTheme="minorEastAsia" w:cstheme="minorEastAsia"/>
-                    <w:i/>
-                    <w:iCs w:val="0"/>
-                    <w:sz w:val="24"/>
-                    <w:szCs w:val="24"/>
-                    <w:vertAlign w:val="baseline"/>
-                    <w:lang w:val="en-US"/>
-                  </w:rPr>
-                </m:ctrlPr>
-              </m:sSubPr>
-              <m:e>
-                <m:r>
-                  <m:rPr/>
-                  <w:rPr>
-                    <w:rFonts w:hint="eastAsia" w:ascii="DejaVu Math TeX Gyre" w:hAnsi="DejaVu Math TeX Gyre" w:eastAsiaTheme="minorEastAsia" w:cstheme="minorEastAsia"/>
-                    <w:sz w:val="24"/>
-                    <w:szCs w:val="24"/>
-                    <w:vertAlign w:val="baseline"/>
-                    <w:lang w:val="en-US"/>
-                  </w:rPr>
-                  <m:t>x</m:t>
-                </m:r>
-                <m:ctrlPr>
-                  <m:rPr/>
-                  <w:rPr>
-                    <w:rFonts w:hint="eastAsia" w:ascii="DejaVu Math TeX Gyre" w:hAnsi="DejaVu Math TeX Gyre" w:eastAsiaTheme="minorEastAsia" w:cstheme="minorEastAsia"/>
-                    <w:i/>
-                    <w:iCs w:val="0"/>
-                    <w:sz w:val="24"/>
-                    <w:szCs w:val="24"/>
-                    <w:vertAlign w:val="baseline"/>
-                    <w:lang w:val="en-US"/>
-                  </w:rPr>
-                </m:ctrlPr>
-              </m:e>
-              <m:sub>
-                <m:r>
-                  <m:rPr/>
-                  <w:rPr>
-                    <w:rFonts w:hint="eastAsia" w:ascii="DejaVu Math TeX Gyre" w:hAnsi="DejaVu Math TeX Gyre" w:eastAsiaTheme="minorEastAsia" w:cstheme="minorEastAsia"/>
-                    <w:sz w:val="24"/>
-                    <w:szCs w:val="24"/>
-                    <w:vertAlign w:val="baseline"/>
-                    <w:lang w:val="en-US"/>
-                  </w:rPr>
-                  <m:t>n</m:t>
-                </m:r>
-                <m:ctrlPr>
-                  <m:rPr/>
-                  <w:rPr>
-                    <w:rFonts w:hint="eastAsia" w:ascii="DejaVu Math TeX Gyre" w:hAnsi="DejaVu Math TeX Gyre" w:eastAsiaTheme="minorEastAsia" w:cstheme="minorEastAsia"/>
-                    <w:i/>
-                    <w:iCs w:val="0"/>
-                    <w:sz w:val="24"/>
-                    <w:szCs w:val="24"/>
-                    <w:vertAlign w:val="baseline"/>
-                    <w:lang w:val="en-US"/>
-                  </w:rPr>
-                </m:ctrlPr>
-              </m:sub>
-            </m:sSub>
-            <m:ctrlPr>
-              <m:rPr/>
-              <w:rPr>
-                <w:rFonts w:hint="eastAsia" w:ascii="DejaVu Math TeX Gyre" w:hAnsi="DejaVu Math TeX Gyre" w:eastAsiaTheme="minorEastAsia" w:cstheme="minorEastAsia"/>
-                <w:i/>
-                <w:iCs w:val="0"/>
-                <w:sz w:val="24"/>
-                <w:szCs w:val="24"/>
-                <w:vertAlign w:val="baseline"/>
-                <w:lang w:val="en-US"/>
-              </w:rPr>
-            </m:ctrlPr>
-          </m:num>
-          <m:den>
-            <m:r>
-              <m:rPr/>
-              <w:rPr>
-                <w:rFonts w:hint="eastAsia" w:ascii="DejaVu Math TeX Gyre" w:hAnsi="DejaVu Math TeX Gyre" w:eastAsiaTheme="minorEastAsia" w:cstheme="minorEastAsia"/>
-                <w:sz w:val="24"/>
-                <w:szCs w:val="24"/>
-                <w:vertAlign w:val="baseline"/>
-                <w:lang w:val="en-US"/>
-              </w:rPr>
-              <m:t>n</m:t>
-            </m:r>
-            <m:ctrlPr>
-              <m:rPr/>
-              <w:rPr>
-                <w:rFonts w:hint="eastAsia" w:ascii="DejaVu Math TeX Gyre" w:hAnsi="DejaVu Math TeX Gyre" w:eastAsiaTheme="minorEastAsia" w:cstheme="minorEastAsia"/>
-                <w:i/>
-                <w:iCs w:val="0"/>
-                <w:sz w:val="24"/>
-                <w:szCs w:val="24"/>
-                <w:vertAlign w:val="baseline"/>
-                <w:lang w:val="en-US"/>
-              </w:rPr>
-            </m:ctrlPr>
-          </m:den>
-        </m:f>
-      </m:oMath>
-      <w:r>
-        <m:rPr/>
+    </w:p>
+    <w:p>
+      <w:pPr>
+        <w:keepNext w:val="0"/>
+        <w:keepLines w:val="0"/>
+        <w:pageBreakBefore w:val="0"/>
+        <w:widowControl w:val="0"/>
+        <w:kinsoku/>
+        <w:wordWrap/>
+        <w:overflowPunct/>
+        <w:topLinePunct w:val="0"/>
+        <w:autoSpaceDE/>
+        <w:autoSpaceDN/>
+        <w:bidi w:val="0"/>
+        <w:adjustRightInd/>
+        <w:snapToGrid/>
+        <w:spacing w:line="360" w:lineRule="auto"/>
+        <w:textAlignment w:val="auto"/>
+        <w:rPr>
+          <w:rFonts w:hint="default" w:asciiTheme="minorEastAsia" w:hAnsiTheme="minorEastAsia" w:cstheme="minorEastAsia"/>
+          <w:i w:val="0"/>
+          <w:iCs w:val="0"/>
+          <w:sz w:val="24"/>
+          <w:szCs w:val="24"/>
+          <w:vertAlign w:val="baseline"/>
+          <w:lang w:val="en-US"/>
+        </w:rPr>
+      </w:pPr>
+      <w:r>
+        <w:rPr>
+          <w:rFonts w:hint="default" w:asciiTheme="minorEastAsia" w:hAnsiTheme="minorEastAsia" w:cstheme="minorEastAsia"/>
+          <w:i w:val="0"/>
+          <w:iCs w:val="0"/>
+          <w:sz w:val="24"/>
+          <w:szCs w:val="24"/>
+          <w:vertAlign w:val="baseline"/>
+          <w:lang w:val="en-US"/>
+        </w:rPr>
+        <w:t>1.2 Mean</w:t>
+      </w:r>
+    </w:p>
+    <w:p>
+      <w:pPr>
+        <w:keepNext w:val="0"/>
+        <w:keepLines w:val="0"/>
+        <w:pageBreakBefore w:val="0"/>
+        <w:widowControl w:val="0"/>
+        <w:kinsoku/>
+        <w:wordWrap/>
+        <w:overflowPunct/>
+        <w:topLinePunct w:val="0"/>
+        <w:autoSpaceDE/>
+        <w:autoSpaceDN/>
+        <w:bidi w:val="0"/>
+        <w:adjustRightInd/>
+        <w:snapToGrid/>
+        <w:spacing w:line="360" w:lineRule="auto"/>
+        <w:textAlignment w:val="auto"/>
         <w:rPr>
           <w:rFonts w:hint="eastAsia" w:asciiTheme="minorEastAsia" w:hAnsiTheme="minorEastAsia" w:eastAsiaTheme="minorEastAsia" w:cstheme="minorEastAsia"/>
           <w:i w:val="0"/>
           <w:iCs w:val="0"/>
           <w:sz w:val="24"/>
           <w:szCs w:val="24"/>
+          <w:lang w:val="en-US"/>
+        </w:rPr>
+      </w:pPr>
+      <m:oMathPara>
+        <m:oMathParaPr>
+          <m:jc m:val="left"/>
+        </m:oMathParaPr>
+        <m:oMath>
+          <m:acc>
+            <m:accPr>
+              <m:chr m:val="̅"/>
+              <m:ctrlPr>
+                <w:rPr>
+                  <w:rFonts w:hint="eastAsia" w:ascii="DejaVu Math TeX Gyre" w:hAnsi="DejaVu Math TeX Gyre" w:eastAsiaTheme="minorEastAsia" w:cstheme="minorEastAsia"/>
+                  <w:i/>
+                  <w:iCs w:val="0"/>
+                  <w:sz w:val="24"/>
+                  <w:szCs w:val="24"/>
+                  <w:vertAlign w:val="baseline"/>
+                  <w:lang w:val="en-US"/>
+                </w:rPr>
+              </m:ctrlPr>
+            </m:accPr>
+            <m:e>
+              <m:r>
+                <m:rPr/>
+                <w:rPr>
+                  <w:rFonts w:hint="eastAsia" w:ascii="DejaVu Math TeX Gyre" w:hAnsi="DejaVu Math TeX Gyre" w:eastAsiaTheme="minorEastAsia" w:cstheme="minorEastAsia"/>
+                  <w:sz w:val="24"/>
+                  <w:szCs w:val="24"/>
+                  <w:vertAlign w:val="baseline"/>
+                  <w:lang w:val="en-US"/>
+                </w:rPr>
+                <m:t>x</m:t>
+              </m:r>
+              <m:ctrlPr>
+                <w:rPr>
+                  <w:rFonts w:hint="eastAsia" w:ascii="DejaVu Math TeX Gyre" w:hAnsi="DejaVu Math TeX Gyre" w:eastAsiaTheme="minorEastAsia" w:cstheme="minorEastAsia"/>
+                  <w:i/>
+                  <w:iCs w:val="0"/>
+                  <w:sz w:val="24"/>
+                  <w:szCs w:val="24"/>
+                  <w:vertAlign w:val="baseline"/>
+                  <w:lang w:val="en-US"/>
+                </w:rPr>
+              </m:ctrlPr>
+            </m:e>
+          </m:acc>
+          <m:r>
+            <m:rPr/>
+            <w:rPr>
+              <w:rFonts w:hint="eastAsia" w:ascii="DejaVu Math TeX Gyre" w:hAnsi="DejaVu Math TeX Gyre" w:eastAsiaTheme="minorEastAsia" w:cstheme="minorEastAsia"/>
+              <w:sz w:val="24"/>
+              <w:szCs w:val="24"/>
+              <w:vertAlign w:val="baseline"/>
+              <w:lang w:val="en-US"/>
+            </w:rPr>
+            <m:t>=</m:t>
+          </m:r>
+          <m:f>
+            <m:fPr>
+              <m:ctrlPr>
+                <w:rPr>
+                  <w:rFonts w:hint="eastAsia" w:ascii="DejaVu Math TeX Gyre" w:hAnsi="DejaVu Math TeX Gyre" w:eastAsiaTheme="minorEastAsia" w:cstheme="minorEastAsia"/>
+                  <w:i/>
+                  <w:iCs w:val="0"/>
+                  <w:sz w:val="24"/>
+                  <w:szCs w:val="24"/>
+                  <w:vertAlign w:val="baseline"/>
+                  <w:lang w:val="en-US"/>
+                </w:rPr>
+              </m:ctrlPr>
+            </m:fPr>
+            <m:num>
+              <m:sSub>
+                <m:sSubPr>
+                  <m:ctrlPr>
+                    <w:rPr>
+                      <w:rFonts w:hint="eastAsia" w:ascii="DejaVu Math TeX Gyre" w:hAnsi="DejaVu Math TeX Gyre" w:eastAsiaTheme="minorEastAsia" w:cstheme="minorEastAsia"/>
+                      <w:i/>
+                      <w:iCs w:val="0"/>
+                      <w:sz w:val="24"/>
+                      <w:szCs w:val="24"/>
+                      <w:vertAlign w:val="baseline"/>
+                      <w:lang w:val="en-US"/>
+                    </w:rPr>
+                  </m:ctrlPr>
+                </m:sSubPr>
+                <m:e>
+                  <m:r>
+                    <m:rPr/>
+                    <w:rPr>
+                      <w:rFonts w:hint="eastAsia" w:ascii="DejaVu Math TeX Gyre" w:hAnsi="DejaVu Math TeX Gyre" w:eastAsiaTheme="minorEastAsia" w:cstheme="minorEastAsia"/>
+                      <w:sz w:val="24"/>
+                      <w:szCs w:val="24"/>
+                      <w:vertAlign w:val="baseline"/>
+                      <w:lang w:val="en-US"/>
+                    </w:rPr>
+                    <m:t>x</m:t>
+                  </m:r>
+                  <m:ctrlPr>
+                    <w:rPr>
+                      <w:rFonts w:hint="eastAsia" w:ascii="DejaVu Math TeX Gyre" w:hAnsi="DejaVu Math TeX Gyre" w:eastAsiaTheme="minorEastAsia" w:cstheme="minorEastAsia"/>
+                      <w:i/>
+                      <w:iCs w:val="0"/>
+                      <w:sz w:val="24"/>
+                      <w:szCs w:val="24"/>
+                      <w:vertAlign w:val="baseline"/>
+                      <w:lang w:val="en-US"/>
+                    </w:rPr>
+                  </m:ctrlPr>
+                </m:e>
+                <m:sub>
+                  <m:r>
+                    <m:rPr/>
+                    <w:rPr>
+                      <w:rFonts w:hint="eastAsia" w:ascii="DejaVu Math TeX Gyre" w:hAnsi="DejaVu Math TeX Gyre" w:eastAsiaTheme="minorEastAsia" w:cstheme="minorEastAsia"/>
+                      <w:sz w:val="24"/>
+                      <w:szCs w:val="24"/>
+                      <w:vertAlign w:val="baseline"/>
+                      <w:lang w:val="en-US"/>
+                    </w:rPr>
+                    <m:t>1</m:t>
+                  </m:r>
+                  <m:ctrlPr>
+                    <w:rPr>
+                      <w:rFonts w:hint="eastAsia" w:ascii="DejaVu Math TeX Gyre" w:hAnsi="DejaVu Math TeX Gyre" w:eastAsiaTheme="minorEastAsia" w:cstheme="minorEastAsia"/>
+                      <w:i/>
+                      <w:iCs w:val="0"/>
+                      <w:sz w:val="24"/>
+                      <w:szCs w:val="24"/>
+                      <w:vertAlign w:val="baseline"/>
+                      <w:lang w:val="en-US"/>
+                    </w:rPr>
+                  </m:ctrlPr>
+                </m:sub>
+              </m:sSub>
+              <m:r>
+                <m:rPr/>
+                <w:rPr>
+                  <w:rFonts w:hint="eastAsia" w:ascii="DejaVu Math TeX Gyre" w:hAnsi="DejaVu Math TeX Gyre" w:eastAsiaTheme="minorEastAsia" w:cstheme="minorEastAsia"/>
+                  <w:sz w:val="24"/>
+                  <w:szCs w:val="24"/>
+                  <w:vertAlign w:val="baseline"/>
+                  <w:lang w:val="en-US"/>
+                </w:rPr>
+                <m:t>+</m:t>
+              </m:r>
+              <m:sSub>
+                <m:sSubPr>
+                  <m:ctrlPr>
+                    <w:rPr>
+                      <w:rFonts w:hint="eastAsia" w:ascii="DejaVu Math TeX Gyre" w:hAnsi="DejaVu Math TeX Gyre" w:eastAsiaTheme="minorEastAsia" w:cstheme="minorEastAsia"/>
+                      <w:i/>
+                      <w:iCs w:val="0"/>
+                      <w:sz w:val="24"/>
+                      <w:szCs w:val="24"/>
+                      <w:vertAlign w:val="baseline"/>
+                      <w:lang w:val="en-US"/>
+                    </w:rPr>
+                  </m:ctrlPr>
+                </m:sSubPr>
+                <m:e>
+                  <m:r>
+                    <m:rPr/>
+                    <w:rPr>
+                      <w:rFonts w:hint="eastAsia" w:ascii="DejaVu Math TeX Gyre" w:hAnsi="DejaVu Math TeX Gyre" w:eastAsiaTheme="minorEastAsia" w:cstheme="minorEastAsia"/>
+                      <w:sz w:val="24"/>
+                      <w:szCs w:val="24"/>
+                      <w:vertAlign w:val="baseline"/>
+                      <w:lang w:val="en-US"/>
+                    </w:rPr>
+                    <m:t>x</m:t>
+                  </m:r>
+                  <m:ctrlPr>
+                    <w:rPr>
+                      <w:rFonts w:hint="eastAsia" w:ascii="DejaVu Math TeX Gyre" w:hAnsi="DejaVu Math TeX Gyre" w:eastAsiaTheme="minorEastAsia" w:cstheme="minorEastAsia"/>
+                      <w:i/>
+                      <w:iCs w:val="0"/>
+                      <w:sz w:val="24"/>
+                      <w:szCs w:val="24"/>
+                      <w:vertAlign w:val="baseline"/>
+                      <w:lang w:val="en-US"/>
+                    </w:rPr>
+                  </m:ctrlPr>
+                </m:e>
+                <m:sub>
+                  <m:r>
+                    <m:rPr/>
+                    <w:rPr>
+                      <w:rFonts w:hint="eastAsia" w:ascii="DejaVu Math TeX Gyre" w:hAnsi="DejaVu Math TeX Gyre" w:eastAsiaTheme="minorEastAsia" w:cstheme="minorEastAsia"/>
+                      <w:sz w:val="24"/>
+                      <w:szCs w:val="24"/>
+                      <w:vertAlign w:val="baseline"/>
+                      <w:lang w:val="en-US"/>
+                    </w:rPr>
+                    <m:t>2</m:t>
+                  </m:r>
+                  <m:ctrlPr>
+                    <w:rPr>
+                      <w:rFonts w:hint="eastAsia" w:ascii="DejaVu Math TeX Gyre" w:hAnsi="DejaVu Math TeX Gyre" w:eastAsiaTheme="minorEastAsia" w:cstheme="minorEastAsia"/>
+                      <w:i/>
+                      <w:iCs w:val="0"/>
+                      <w:sz w:val="24"/>
+                      <w:szCs w:val="24"/>
+                      <w:vertAlign w:val="baseline"/>
+                      <w:lang w:val="en-US"/>
+                    </w:rPr>
+                  </m:ctrlPr>
+                </m:sub>
+              </m:sSub>
+              <m:r>
+                <m:rPr/>
+                <w:rPr>
+                  <w:rFonts w:hint="eastAsia" w:ascii="DejaVu Math TeX Gyre" w:hAnsi="DejaVu Math TeX Gyre" w:eastAsiaTheme="minorEastAsia" w:cstheme="minorEastAsia"/>
+                  <w:sz w:val="24"/>
+                  <w:szCs w:val="24"/>
+                  <w:vertAlign w:val="baseline"/>
+                  <w:lang w:val="en-US"/>
+                </w:rPr>
+                <m:t>+</m:t>
+              </m:r>
+              <m:sSub>
+                <m:sSubPr>
+                  <m:ctrlPr>
+                    <w:rPr>
+                      <w:rFonts w:hint="eastAsia" w:ascii="DejaVu Math TeX Gyre" w:hAnsi="DejaVu Math TeX Gyre" w:eastAsiaTheme="minorEastAsia" w:cstheme="minorEastAsia"/>
+                      <w:i/>
+                      <w:iCs w:val="0"/>
+                      <w:sz w:val="24"/>
+                      <w:szCs w:val="24"/>
+                      <w:vertAlign w:val="baseline"/>
+                      <w:lang w:val="en-US"/>
+                    </w:rPr>
+                  </m:ctrlPr>
+                </m:sSubPr>
+                <m:e>
+                  <m:r>
+                    <m:rPr/>
+                    <w:rPr>
+                      <w:rFonts w:hint="eastAsia" w:ascii="DejaVu Math TeX Gyre" w:hAnsi="DejaVu Math TeX Gyre" w:eastAsiaTheme="minorEastAsia" w:cstheme="minorEastAsia"/>
+                      <w:sz w:val="24"/>
+                      <w:szCs w:val="24"/>
+                      <w:vertAlign w:val="baseline"/>
+                      <w:lang w:val="en-US"/>
+                    </w:rPr>
+                    <m:t>x</m:t>
+                  </m:r>
+                  <m:ctrlPr>
+                    <w:rPr>
+                      <w:rFonts w:hint="eastAsia" w:ascii="DejaVu Math TeX Gyre" w:hAnsi="DejaVu Math TeX Gyre" w:eastAsiaTheme="minorEastAsia" w:cstheme="minorEastAsia"/>
+                      <w:i/>
+                      <w:iCs w:val="0"/>
+                      <w:sz w:val="24"/>
+                      <w:szCs w:val="24"/>
+                      <w:vertAlign w:val="baseline"/>
+                      <w:lang w:val="en-US"/>
+                    </w:rPr>
+                  </m:ctrlPr>
+                </m:e>
+                <m:sub>
+                  <m:r>
+                    <m:rPr/>
+                    <w:rPr>
+                      <w:rFonts w:hint="eastAsia" w:ascii="DejaVu Math TeX Gyre" w:hAnsi="DejaVu Math TeX Gyre" w:eastAsiaTheme="minorEastAsia" w:cstheme="minorEastAsia"/>
+                      <w:sz w:val="24"/>
+                      <w:szCs w:val="24"/>
+                      <w:vertAlign w:val="baseline"/>
+                      <w:lang w:val="en-US"/>
+                    </w:rPr>
+                    <m:t>3</m:t>
+                  </m:r>
+                  <m:ctrlPr>
+                    <w:rPr>
+                      <w:rFonts w:hint="eastAsia" w:ascii="DejaVu Math TeX Gyre" w:hAnsi="DejaVu Math TeX Gyre" w:eastAsiaTheme="minorEastAsia" w:cstheme="minorEastAsia"/>
+                      <w:i/>
+                      <w:iCs w:val="0"/>
+                      <w:sz w:val="24"/>
+                      <w:szCs w:val="24"/>
+                      <w:vertAlign w:val="baseline"/>
+                      <w:lang w:val="en-US"/>
+                    </w:rPr>
+                  </m:ctrlPr>
+                </m:sub>
+              </m:sSub>
+              <m:r>
+                <m:rPr/>
+                <w:rPr>
+                  <w:rFonts w:hint="eastAsia" w:ascii="DejaVu Math TeX Gyre" w:hAnsi="DejaVu Math TeX Gyre" w:eastAsiaTheme="minorEastAsia" w:cstheme="minorEastAsia"/>
+                  <w:sz w:val="24"/>
+                  <w:szCs w:val="24"/>
+                  <w:vertAlign w:val="baseline"/>
+                  <w:lang w:val="en-US"/>
+                </w:rPr>
+                <m:t>+...+</m:t>
+              </m:r>
+              <m:sSub>
+                <m:sSubPr>
+                  <m:ctrlPr>
+                    <w:rPr>
+                      <w:rFonts w:hint="eastAsia" w:ascii="DejaVu Math TeX Gyre" w:hAnsi="DejaVu Math TeX Gyre" w:eastAsiaTheme="minorEastAsia" w:cstheme="minorEastAsia"/>
+                      <w:i/>
+                      <w:iCs w:val="0"/>
+                      <w:sz w:val="24"/>
+                      <w:szCs w:val="24"/>
+                      <w:vertAlign w:val="baseline"/>
+                      <w:lang w:val="en-US"/>
+                    </w:rPr>
+                  </m:ctrlPr>
+                </m:sSubPr>
+                <m:e>
+                  <m:r>
+                    <m:rPr/>
+                    <w:rPr>
+                      <w:rFonts w:hint="eastAsia" w:ascii="DejaVu Math TeX Gyre" w:hAnsi="DejaVu Math TeX Gyre" w:eastAsiaTheme="minorEastAsia" w:cstheme="minorEastAsia"/>
+                      <w:sz w:val="24"/>
+                      <w:szCs w:val="24"/>
+                      <w:vertAlign w:val="baseline"/>
+                      <w:lang w:val="en-US"/>
+                    </w:rPr>
+                    <m:t>x</m:t>
+                  </m:r>
+                  <m:ctrlPr>
+                    <w:rPr>
+                      <w:rFonts w:hint="eastAsia" w:ascii="DejaVu Math TeX Gyre" w:hAnsi="DejaVu Math TeX Gyre" w:eastAsiaTheme="minorEastAsia" w:cstheme="minorEastAsia"/>
+                      <w:i/>
+                      <w:iCs w:val="0"/>
+                      <w:sz w:val="24"/>
+                      <w:szCs w:val="24"/>
+                      <w:vertAlign w:val="baseline"/>
+                      <w:lang w:val="en-US"/>
+                    </w:rPr>
+                  </m:ctrlPr>
+                </m:e>
+                <m:sub>
+                  <m:r>
+                    <m:rPr/>
+                    <w:rPr>
+                      <w:rFonts w:hint="eastAsia" w:ascii="DejaVu Math TeX Gyre" w:hAnsi="DejaVu Math TeX Gyre" w:eastAsiaTheme="minorEastAsia" w:cstheme="minorEastAsia"/>
+                      <w:sz w:val="24"/>
+                      <w:szCs w:val="24"/>
+                      <w:vertAlign w:val="baseline"/>
+                      <w:lang w:val="en-US"/>
+                    </w:rPr>
+                    <m:t>n</m:t>
+                  </m:r>
+                  <m:ctrlPr>
+                    <w:rPr>
+                      <w:rFonts w:hint="eastAsia" w:ascii="DejaVu Math TeX Gyre" w:hAnsi="DejaVu Math TeX Gyre" w:eastAsiaTheme="minorEastAsia" w:cstheme="minorEastAsia"/>
+                      <w:i/>
+                      <w:iCs w:val="0"/>
+                      <w:sz w:val="24"/>
+                      <w:szCs w:val="24"/>
+                      <w:vertAlign w:val="baseline"/>
+                      <w:lang w:val="en-US"/>
+                    </w:rPr>
+                  </m:ctrlPr>
+                </m:sub>
+              </m:sSub>
+              <m:ctrlPr>
+                <w:rPr>
+                  <w:rFonts w:hint="eastAsia" w:ascii="DejaVu Math TeX Gyre" w:hAnsi="DejaVu Math TeX Gyre" w:eastAsiaTheme="minorEastAsia" w:cstheme="minorEastAsia"/>
+                  <w:i/>
+                  <w:iCs w:val="0"/>
+                  <w:sz w:val="24"/>
+                  <w:szCs w:val="24"/>
+                  <w:vertAlign w:val="baseline"/>
+                  <w:lang w:val="en-US"/>
+                </w:rPr>
+              </m:ctrlPr>
+            </m:num>
+            <m:den>
+              <m:r>
+                <m:rPr/>
+                <w:rPr>
+                  <w:rFonts w:hint="eastAsia" w:ascii="DejaVu Math TeX Gyre" w:hAnsi="DejaVu Math TeX Gyre" w:eastAsiaTheme="minorEastAsia" w:cstheme="minorEastAsia"/>
+                  <w:sz w:val="24"/>
+                  <w:szCs w:val="24"/>
+                  <w:vertAlign w:val="baseline"/>
+                  <w:lang w:val="en-US"/>
+                </w:rPr>
+                <m:t>n</m:t>
+              </m:r>
+              <m:ctrlPr>
+                <w:rPr>
+                  <w:rFonts w:hint="eastAsia" w:ascii="DejaVu Math TeX Gyre" w:hAnsi="DejaVu Math TeX Gyre" w:eastAsiaTheme="minorEastAsia" w:cstheme="minorEastAsia"/>
+                  <w:i/>
+                  <w:iCs w:val="0"/>
+                  <w:sz w:val="24"/>
+                  <w:szCs w:val="24"/>
+                  <w:vertAlign w:val="baseline"/>
+                  <w:lang w:val="en-US"/>
+                </w:rPr>
+              </m:ctrlPr>
+            </m:den>
+          </m:f>
+        </m:oMath>
+      </m:oMathPara>
+      <w:r>
+        <w:rPr>
+          <w:rFonts w:hint="eastAsia" w:hAnsi="DejaVu Math TeX Gyre" w:eastAsiaTheme="minorEastAsia" w:cstheme="minorEastAsia"/>
+          <w:i w:val="0"/>
+          <w:iCs w:val="0"/>
+          <w:sz w:val="24"/>
+          <w:szCs w:val="24"/>
           <w:vertAlign w:val="baseline"/>
           <w:lang w:val="en-US"/>
         </w:rPr>
-        <w:t xml:space="preserve">, </w:t>
+        <w:br w:type="textWrapping"/>
+      </w:r>
+      <w:r>
+        <w:rPr>
+          <w:rFonts w:hint="eastAsia" w:asciiTheme="minorEastAsia" w:hAnsiTheme="minorEastAsia" w:eastAsiaTheme="minorEastAsia" w:cstheme="minorEastAsia"/>
+          <w:i w:val="0"/>
+          <w:iCs w:val="0"/>
+          <w:sz w:val="24"/>
+          <w:szCs w:val="24"/>
+          <w:vertAlign w:val="baseline"/>
+          <w:lang w:val="en-US"/>
+        </w:rPr>
+        <w:t xml:space="preserve">1.3 </w:t>
+      </w:r>
+      <w:r>
+        <w:rPr>
+          <w:rFonts w:hint="eastAsia" w:asciiTheme="minorEastAsia" w:hAnsiTheme="minorEastAsia" w:eastAsiaTheme="minorEastAsia" w:cstheme="minorEastAsia"/>
+          <w:i w:val="0"/>
+          <w:iCs w:val="0"/>
+          <w:sz w:val="24"/>
+          <w:szCs w:val="24"/>
+          <w:lang w:val="en-US"/>
+        </w:rPr>
+        <w:t>Standard Deviation</w:t>
+      </w:r>
+    </w:p>
+    <w:p>
+      <w:pPr>
+        <w:keepNext w:val="0"/>
+        <w:keepLines w:val="0"/>
+        <w:pageBreakBefore w:val="0"/>
+        <w:widowControl w:val="0"/>
+        <w:kinsoku/>
+        <w:wordWrap/>
+        <w:overflowPunct/>
+        <w:topLinePunct w:val="0"/>
+        <w:autoSpaceDE/>
+        <w:autoSpaceDN/>
+        <w:bidi w:val="0"/>
+        <w:adjustRightInd/>
+        <w:snapToGrid/>
+        <w:spacing w:line="360" w:lineRule="auto"/>
+        <w:textAlignment w:val="auto"/>
+        <w:rPr>
+          <w:rFonts w:hint="eastAsia" w:asciiTheme="minorEastAsia" w:hAnsiTheme="minorEastAsia" w:eastAsiaTheme="minorEastAsia" w:cstheme="minorEastAsia"/>
+          <w:i w:val="0"/>
+          <w:iCs w:val="0"/>
+          <w:sz w:val="24"/>
+          <w:szCs w:val="24"/>
+          <w:vertAlign w:val="baseline"/>
+          <w:lang w:val="en-US"/>
+        </w:rPr>
+      </w:pPr>
+      <w:r>
+        <w:rPr>
+          <w:rFonts w:hint="eastAsia" w:asciiTheme="minorEastAsia" w:hAnsiTheme="minorEastAsia" w:eastAsiaTheme="minorEastAsia" w:cstheme="minorEastAsia"/>
+          <w:i w:val="0"/>
+          <w:iCs w:val="0"/>
+          <w:sz w:val="24"/>
+          <w:szCs w:val="24"/>
+          <w:vertAlign w:val="baseline"/>
+          <w:lang w:val="en-US"/>
+        </w:rPr>
+        <w:t xml:space="preserve"> </w:t>
       </w:r>
       <m:oMath>
         <m:r>
@@ -5455,7 +5585,6 @@
           <m:radPr>
             <m:degHide m:val="1"/>
             <m:ctrlPr>
-              <m:rPr/>
               <w:rPr>
                 <w:rFonts w:hint="eastAsia" w:ascii="DejaVu Math TeX Gyre" w:hAnsi="DejaVu Math TeX Gyre" w:eastAsiaTheme="minorEastAsia" w:cstheme="minorEastAsia"/>
                 <w:i/>
@@ -5470,7 +5599,6 @@
           </m:radPr>
           <m:deg>
             <m:ctrlPr>
-              <m:rPr/>
               <w:rPr>
                 <w:rFonts w:hint="eastAsia" w:ascii="DejaVu Math TeX Gyre" w:hAnsi="DejaVu Math TeX Gyre" w:eastAsiaTheme="minorEastAsia" w:cstheme="minorEastAsia"/>
                 <w:i/>
@@ -5487,7 +5615,6 @@
             <m:f>
               <m:fPr>
                 <m:ctrlPr>
-                  <m:rPr/>
                   <w:rPr>
                     <w:rFonts w:hint="eastAsia" w:ascii="DejaVu Math TeX Gyre" w:hAnsi="DejaVu Math TeX Gyre" w:eastAsiaTheme="minorEastAsia" w:cstheme="minorEastAsia"/>
                     <w:i/>
@@ -5508,7 +5635,6 @@
                     <m:subHide m:val="1"/>
                     <m:supHide m:val="1"/>
                     <m:ctrlPr>
-                      <m:rPr/>
                       <w:rPr>
                         <w:rFonts w:hint="eastAsia" w:ascii="DejaVu Math TeX Gyre" w:hAnsi="DejaVu Math TeX Gyre" w:eastAsiaTheme="minorEastAsia" w:cstheme="minorEastAsia"/>
                         <w:i/>
@@ -5523,7 +5649,6 @@
                   </m:naryPr>
                   <m:sub>
                     <m:ctrlPr>
-                      <m:rPr/>
                       <w:rPr>
                         <w:rFonts w:hint="eastAsia" w:ascii="DejaVu Math TeX Gyre" w:hAnsi="DejaVu Math TeX Gyre" w:eastAsiaTheme="minorEastAsia" w:cstheme="minorEastAsia"/>
                         <w:i/>
@@ -5538,7 +5663,6 @@
                   </m:sub>
                   <m:sup>
                     <m:ctrlPr>
-                      <m:rPr/>
                       <w:rPr>
                         <w:rFonts w:hint="eastAsia" w:ascii="DejaVu Math TeX Gyre" w:hAnsi="DejaVu Math TeX Gyre" w:eastAsiaTheme="minorEastAsia" w:cstheme="minorEastAsia"/>
                         <w:i/>
@@ -5555,7 +5679,6 @@
                     <m:sSup>
                       <m:sSupPr>
                         <m:ctrlPr>
-                          <m:rPr/>
                           <w:rPr>
                             <w:rFonts w:hint="eastAsia" w:ascii="DejaVu Math TeX Gyre" w:hAnsi="DejaVu Math TeX Gyre" w:eastAsiaTheme="minorEastAsia" w:cstheme="minorEastAsia"/>
                             <w:i/>
@@ -5584,7 +5707,6 @@
                         <m:sSub>
                           <m:sSubPr>
                             <m:ctrlPr>
-                              <m:rPr/>
                               <w:rPr>
                                 <w:rFonts w:hint="eastAsia" w:ascii="DejaVu Math TeX Gyre" w:hAnsi="DejaVu Math TeX Gyre" w:eastAsiaTheme="minorEastAsia" w:cstheme="minorEastAsia"/>
                                 <w:i/>
@@ -5611,7 +5733,6 @@
                               <m:t>x</m:t>
                             </m:r>
                             <m:ctrlPr>
-                              <m:rPr/>
                               <w:rPr>
                                 <w:rFonts w:hint="eastAsia" w:ascii="DejaVu Math TeX Gyre" w:hAnsi="DejaVu Math TeX Gyre" w:eastAsiaTheme="minorEastAsia" w:cstheme="minorEastAsia"/>
                                 <w:i/>
@@ -5638,7 +5759,6 @@
                               <m:t>i</m:t>
                             </m:r>
                             <m:ctrlPr>
-                              <m:rPr/>
                               <w:rPr>
                                 <w:rFonts w:hint="eastAsia" w:ascii="DejaVu Math TeX Gyre" w:hAnsi="DejaVu Math TeX Gyre" w:eastAsiaTheme="minorEastAsia" w:cstheme="minorEastAsia"/>
                                 <w:i/>
@@ -5668,7 +5788,6 @@
                           <m:accPr>
                             <m:chr m:val="̅"/>
                             <m:ctrlPr>
-                              <m:rPr/>
                               <w:rPr>
                                 <w:rFonts w:hint="eastAsia" w:ascii="DejaVu Math TeX Gyre" w:hAnsi="DejaVu Math TeX Gyre" w:eastAsiaTheme="minorEastAsia" w:cstheme="minorEastAsia"/>
                                 <w:i/>
@@ -5695,7 +5814,6 @@
                               <m:t>x</m:t>
                             </m:r>
                             <m:ctrlPr>
-                              <m:rPr/>
                               <w:rPr>
                                 <w:rFonts w:hint="eastAsia" w:ascii="DejaVu Math TeX Gyre" w:hAnsi="DejaVu Math TeX Gyre" w:eastAsiaTheme="minorEastAsia" w:cstheme="minorEastAsia"/>
                                 <w:i/>
@@ -5722,7 +5840,6 @@
                           <m:t>)</m:t>
                         </m:r>
                         <m:ctrlPr>
-                          <m:rPr/>
                           <w:rPr>
                             <w:rFonts w:hint="eastAsia" w:ascii="DejaVu Math TeX Gyre" w:hAnsi="DejaVu Math TeX Gyre" w:eastAsiaTheme="minorEastAsia" w:cstheme="minorEastAsia"/>
                             <w:i/>
@@ -5749,7 +5866,6 @@
                           <m:t>2</m:t>
                         </m:r>
                         <m:ctrlPr>
-                          <m:rPr/>
                           <w:rPr>
                             <w:rFonts w:hint="eastAsia" w:ascii="DejaVu Math TeX Gyre" w:hAnsi="DejaVu Math TeX Gyre" w:eastAsiaTheme="minorEastAsia" w:cstheme="minorEastAsia"/>
                             <w:i/>
@@ -5764,7 +5880,6 @@
                       </m:sup>
                     </m:sSup>
                     <m:ctrlPr>
-                      <m:rPr/>
                       <w:rPr>
                         <w:rFonts w:hint="eastAsia" w:ascii="DejaVu Math TeX Gyre" w:hAnsi="DejaVu Math TeX Gyre" w:eastAsiaTheme="minorEastAsia" w:cstheme="minorEastAsia"/>
                         <w:i/>
@@ -5779,7 +5894,6 @@
                   </m:e>
                 </m:nary>
                 <m:ctrlPr>
-                  <m:rPr/>
                   <w:rPr>
                     <w:rFonts w:hint="eastAsia" w:ascii="DejaVu Math TeX Gyre" w:hAnsi="DejaVu Math TeX Gyre" w:eastAsiaTheme="minorEastAsia" w:cstheme="minorEastAsia"/>
                     <w:i/>
@@ -5806,7 +5920,6 @@
                   <m:t>n−1</m:t>
                 </m:r>
                 <m:ctrlPr>
-                  <m:rPr/>
                   <w:rPr>
                     <w:rFonts w:hint="eastAsia" w:ascii="DejaVu Math TeX Gyre" w:hAnsi="DejaVu Math TeX Gyre" w:eastAsiaTheme="minorEastAsia" w:cstheme="minorEastAsia"/>
                     <w:i/>
@@ -5821,7 +5934,6 @@
               </m:den>
             </m:f>
             <m:ctrlPr>
-              <m:rPr/>
               <w:rPr>
                 <w:rFonts w:hint="eastAsia" w:ascii="DejaVu Math TeX Gyre" w:hAnsi="DejaVu Math TeX Gyre" w:eastAsiaTheme="minorEastAsia" w:cstheme="minorEastAsia"/>
                 <w:i/>
@@ -5844,6 +5956,7 @@
         <w:pageBreakBefore w:val="0"/>
         <w:widowControl w:val="0"/>
         <w:numPr>
+          <w:ilvl w:val="0"/>
           <w:numId w:val="0"/>
         </w:numPr>
         <w:kinsoku/>
@@ -5885,6 +5998,7 @@
         <w:pageBreakBefore w:val="0"/>
         <w:widowControl w:val="0"/>
         <w:numPr>
+          <w:ilvl w:val="0"/>
           <w:numId w:val="0"/>
         </w:numPr>
         <w:kinsoku/>
@@ -6033,8 +6147,6 @@
           </m:den>
         </m:f>
       </m:oMath>
-      <w:bookmarkStart w:id="0" w:name="_GoBack"/>
-      <w:bookmarkEnd w:id="0"/>
     </w:p>
     <w:p>
       <w:pPr>
@@ -6043,6 +6155,7 @@
         <w:pageBreakBefore w:val="0"/>
         <w:widowControl w:val="0"/>
         <w:numPr>
+          <w:ilvl w:val="0"/>
           <w:numId w:val="0"/>
         </w:numPr>
         <w:kinsoku/>
@@ -6057,7 +6170,7 @@
         <w:spacing w:line="360" w:lineRule="auto"/>
         <w:textAlignment w:val="auto"/>
         <w:rPr>
-          <w:rFonts w:hint="eastAsia" w:hAnsi="DejaVu Math TeX Gyre" w:eastAsiaTheme="minorEastAsia" w:cstheme="minorEastAsia"/>
+          <w:rFonts w:hint="eastAsia" w:asciiTheme="minorEastAsia" w:hAnsiTheme="minorEastAsia" w:eastAsiaTheme="minorEastAsia" w:cstheme="minorEastAsia"/>
           <w:i w:val="0"/>
           <w:iCs w:val="0"/>
           <w:sz w:val="24"/>
@@ -6065,6 +6178,17 @@
           <w:lang w:val="en-US"/>
         </w:rPr>
       </w:pPr>
+      <w:r>
+        <w:rPr>
+          <w:rFonts w:hint="eastAsia" w:asciiTheme="minorEastAsia" w:hAnsiTheme="minorEastAsia" w:eastAsiaTheme="minorEastAsia" w:cstheme="minorEastAsia"/>
+          <w:i w:val="0"/>
+          <w:iCs w:val="0"/>
+          <w:sz w:val="24"/>
+          <w:szCs w:val="24"/>
+          <w:lang w:val="en-US"/>
+        </w:rPr>
+        <w:t xml:space="preserve">2.2 Data: </w:t>
+      </w:r>
       <m:oMath>
         <m:f>
           <m:fPr>
@@ -6152,7 +6276,6 @@
               <m:accPr>
                 <m:chr m:val="̅"/>
                 <m:ctrlPr>
-                  <m:rPr/>
                   <w:rPr>
                     <w:rFonts w:hint="eastAsia" w:ascii="DejaVu Math TeX Gyre" w:hAnsi="DejaVu Math TeX Gyre" w:eastAsiaTheme="minorEastAsia" w:cstheme="minorEastAsia"/>
                     <w:i/>
@@ -6175,7 +6298,6 @@
                   <m:t>x</m:t>
                 </m:r>
                 <m:ctrlPr>
-                  <m:rPr/>
                   <w:rPr>
                     <w:rFonts w:hint="eastAsia" w:ascii="DejaVu Math TeX Gyre" w:hAnsi="DejaVu Math TeX Gyre" w:eastAsiaTheme="minorEastAsia" w:cstheme="minorEastAsia"/>
                     <w:i/>
@@ -6728,6 +6850,7 @@
         <w:pageBreakBefore w:val="0"/>
         <w:widowControl w:val="0"/>
         <w:numPr>
+          <w:ilvl w:val="0"/>
           <w:numId w:val="0"/>
         </w:numPr>
         <w:kinsoku/>
@@ -6750,6 +6873,39 @@
           <w:lang w:val="en-US"/>
         </w:rPr>
       </w:pPr>
+      <w:r>
+        <w:rPr>
+          <w:rFonts w:hint="eastAsia" w:asciiTheme="minorEastAsia" w:hAnsiTheme="minorEastAsia" w:eastAsiaTheme="minorEastAsia" w:cstheme="minorEastAsia"/>
+          <w:i w:val="0"/>
+          <w:iCs w:val="0"/>
+          <w:sz w:val="24"/>
+          <w:szCs w:val="24"/>
+          <w:lang w:val="en-US"/>
+        </w:rPr>
+        <w:t>2.</w:t>
+      </w:r>
+      <w:r>
+        <w:rPr>
+          <w:rFonts w:hint="default" w:asciiTheme="minorEastAsia" w:hAnsiTheme="minorEastAsia" w:cstheme="minorEastAsia"/>
+          <w:i w:val="0"/>
+          <w:iCs w:val="0"/>
+          <w:sz w:val="24"/>
+          <w:szCs w:val="24"/>
+          <w:lang w:val="en-US"/>
+        </w:rPr>
+        <w:t>3</w:t>
+      </w:r>
+      <w:r>
+        <w:rPr>
+          <w:rFonts w:hint="eastAsia" w:asciiTheme="minorEastAsia" w:hAnsiTheme="minorEastAsia" w:eastAsiaTheme="minorEastAsia" w:cstheme="minorEastAsia"/>
+          <w:i w:val="0"/>
+          <w:iCs w:val="0"/>
+          <w:sz w:val="24"/>
+          <w:szCs w:val="24"/>
+          <w:lang w:val="en-US"/>
+        </w:rPr>
+        <w:t xml:space="preserve"> Mean</w:t>
+      </w:r>
     </w:p>
     <w:p>
       <w:pPr>
@@ -6758,6 +6914,7 @@
         <w:pageBreakBefore w:val="0"/>
         <w:widowControl w:val="0"/>
         <w:numPr>
+          <w:ilvl w:val="0"/>
           <w:numId w:val="0"/>
         </w:numPr>
         <w:kinsoku/>
@@ -6771,48 +6928,6 @@
         <w:snapToGrid/>
         <w:spacing w:line="360" w:lineRule="auto"/>
         <w:textAlignment w:val="auto"/>
-        <w:rPr>
-          <w:rFonts w:hint="eastAsia" w:asciiTheme="minorEastAsia" w:hAnsiTheme="minorEastAsia" w:eastAsiaTheme="minorEastAsia" w:cstheme="minorEastAsia"/>
-          <w:i w:val="0"/>
-          <w:iCs w:val="0"/>
-          <w:sz w:val="24"/>
-          <w:szCs w:val="24"/>
-          <w:lang w:val="en-US"/>
-        </w:rPr>
-      </w:pPr>
-      <w:r>
-        <w:rPr>
-          <w:rFonts w:hint="eastAsia" w:asciiTheme="minorEastAsia" w:hAnsiTheme="minorEastAsia" w:eastAsiaTheme="minorEastAsia" w:cstheme="minorEastAsia"/>
-          <w:i w:val="0"/>
-          <w:iCs w:val="0"/>
-          <w:sz w:val="24"/>
-          <w:szCs w:val="24"/>
-          <w:lang w:val="en-US"/>
-        </w:rPr>
-        <w:t>2.2 Mean</w:t>
-      </w:r>
-    </w:p>
-    <w:p>
-      <w:pPr>
-        <w:keepNext w:val="0"/>
-        <w:keepLines w:val="0"/>
-        <w:pageBreakBefore w:val="0"/>
-        <w:widowControl w:val="0"/>
-        <w:numPr>
-          <w:numId w:val="0"/>
-        </w:numPr>
-        <w:kinsoku/>
-        <w:wordWrap/>
-        <w:overflowPunct/>
-        <w:topLinePunct w:val="0"/>
-        <w:autoSpaceDE/>
-        <w:autoSpaceDN/>
-        <w:bidi w:val="0"/>
-        <w:adjustRightInd/>
-        <w:snapToGrid/>
-        <w:spacing w:line="360" w:lineRule="auto"/>
-        <w:textAlignment w:val="auto"/>
-        <m:rPr/>
         <w:rPr>
           <w:rFonts w:hint="eastAsia" w:asciiTheme="minorEastAsia" w:hAnsiTheme="minorEastAsia" w:eastAsiaTheme="minorEastAsia" w:cstheme="minorEastAsia"/>
           <w:i w:val="0"/>
@@ -7635,7 +7750,6 @@
                 <m:f>
                   <m:fPr>
                     <m:ctrlPr>
-                      <m:rPr/>
                       <w:rPr>
                         <w:rFonts w:hint="eastAsia" w:ascii="DejaVu Math TeX Gyre" w:hAnsi="DejaVu Math TeX Gyre" w:eastAsiaTheme="minorEastAsia" w:cstheme="minorEastAsia"/>
                         <w:i/>
@@ -7923,7 +8037,6 @@
                       <m:accPr>
                         <m:chr m:val="̅"/>
                         <m:ctrlPr>
-                          <m:rPr/>
                           <w:rPr>
                             <w:rFonts w:hint="eastAsia" w:ascii="DejaVu Math TeX Gyre" w:hAnsi="DejaVu Math TeX Gyre" w:eastAsiaTheme="minorEastAsia" w:cstheme="minorEastAsia"/>
                             <w:i/>
@@ -7946,7 +8059,6 @@
                           <m:t>x</m:t>
                         </m:r>
                         <m:ctrlPr>
-                          <m:rPr/>
                           <w:rPr>
                             <w:rFonts w:hint="eastAsia" w:ascii="DejaVu Math TeX Gyre" w:hAnsi="DejaVu Math TeX Gyre" w:eastAsiaTheme="minorEastAsia" w:cstheme="minorEastAsia"/>
                             <w:i/>
@@ -7959,7 +8071,6 @@
                       </m:e>
                     </m:acc>
                     <m:ctrlPr>
-                      <m:rPr/>
                       <w:rPr>
                         <w:rFonts w:hint="eastAsia" w:ascii="DejaVu Math TeX Gyre" w:hAnsi="DejaVu Math TeX Gyre" w:eastAsiaTheme="minorEastAsia" w:cstheme="minorEastAsia"/>
                         <w:i/>
@@ -7982,7 +8093,6 @@
                       <m:t>n</m:t>
                     </m:r>
                     <m:ctrlPr>
-                      <m:rPr/>
                       <w:rPr>
                         <w:rFonts w:hint="eastAsia" w:ascii="DejaVu Math TeX Gyre" w:hAnsi="DejaVu Math TeX Gyre" w:eastAsiaTheme="minorEastAsia" w:cstheme="minorEastAsia"/>
                         <w:i/>
@@ -8007,7 +8117,6 @@
                 <m:f>
                   <m:fPr>
                     <m:ctrlPr>
-                      <m:rPr/>
                       <w:rPr>
                         <w:rFonts w:hint="eastAsia" w:ascii="DejaVu Math TeX Gyre" w:hAnsi="DejaVu Math TeX Gyre" w:eastAsiaTheme="minorEastAsia" w:cstheme="minorEastAsia"/>
                         <w:i/>
@@ -8030,7 +8139,6 @@
                       <m:t>1</m:t>
                     </m:r>
                     <m:ctrlPr>
-                      <m:rPr/>
                       <w:rPr>
                         <w:rFonts w:hint="eastAsia" w:ascii="DejaVu Math TeX Gyre" w:hAnsi="DejaVu Math TeX Gyre" w:eastAsiaTheme="minorEastAsia" w:cstheme="minorEastAsia"/>
                         <w:i/>
@@ -8053,7 +8161,6 @@
                       <m:t>s</m:t>
                     </m:r>
                     <m:ctrlPr>
-                      <m:rPr/>
                       <w:rPr>
                         <w:rFonts w:hint="eastAsia" w:ascii="DejaVu Math TeX Gyre" w:hAnsi="DejaVu Math TeX Gyre" w:eastAsiaTheme="minorEastAsia" w:cstheme="minorEastAsia"/>
                         <w:i/>
@@ -8501,7 +8608,6 @@
                   <m:t>)</m:t>
                 </m:r>
                 <m:ctrlPr>
-                  <m:rPr/>
                   <w:rPr>
                     <w:rFonts w:hint="eastAsia" w:ascii="DejaVu Math TeX Gyre" w:hAnsi="DejaVu Math TeX Gyre" w:eastAsiaTheme="minorEastAsia" w:cstheme="minorEastAsia"/>
                     <w:i/>
@@ -8516,7 +8622,6 @@
             <m:mr>
               <m:e>
                 <m:ctrlPr>
-                  <m:rPr/>
                   <w:rPr>
                     <w:rFonts w:hint="eastAsia" w:ascii="DejaVu Math TeX Gyre" w:hAnsi="DejaVu Math TeX Gyre" w:eastAsiaTheme="minorEastAsia" w:cstheme="minorEastAsia"/>
                     <w:i/>
@@ -8543,7 +8648,6 @@
                 <m:f>
                   <m:fPr>
                     <m:ctrlPr>
-                      <m:rPr/>
                       <w:rPr>
                         <w:rFonts w:hint="eastAsia" w:ascii="DejaVu Math TeX Gyre" w:hAnsi="DejaVu Math TeX Gyre" w:eastAsiaTheme="minorEastAsia" w:cstheme="minorEastAsia"/>
                         <w:i/>
@@ -8566,7 +8670,6 @@
                       <m:t>1</m:t>
                     </m:r>
                     <m:ctrlPr>
-                      <m:rPr/>
                       <w:rPr>
                         <w:rFonts w:hint="eastAsia" w:ascii="DejaVu Math TeX Gyre" w:hAnsi="DejaVu Math TeX Gyre" w:eastAsiaTheme="minorEastAsia" w:cstheme="minorEastAsia"/>
                         <w:i/>
@@ -8589,7 +8692,6 @@
                       <m:t>x</m:t>
                     </m:r>
                     <m:ctrlPr>
-                      <m:rPr/>
                       <w:rPr>
                         <w:rFonts w:hint="eastAsia" w:ascii="DejaVu Math TeX Gyre" w:hAnsi="DejaVu Math TeX Gyre" w:eastAsiaTheme="minorEastAsia" w:cstheme="minorEastAsia"/>
                         <w:i/>
@@ -8615,7 +8717,6 @@
                   <m:accPr>
                     <m:chr m:val="̅"/>
                     <m:ctrlPr>
-                      <m:rPr/>
                       <w:rPr>
                         <w:rFonts w:hint="eastAsia" w:ascii="DejaVu Math TeX Gyre" w:hAnsi="DejaVu Math TeX Gyre" w:eastAsiaTheme="minorEastAsia" w:cstheme="minorEastAsia"/>
                         <w:i/>
@@ -8638,7 +8739,6 @@
                       <m:t>x</m:t>
                     </m:r>
                     <m:ctrlPr>
-                      <m:rPr/>
                       <w:rPr>
                         <w:rFonts w:hint="eastAsia" w:ascii="DejaVu Math TeX Gyre" w:hAnsi="DejaVu Math TeX Gyre" w:eastAsiaTheme="minorEastAsia" w:cstheme="minorEastAsia"/>
                         <w:i/>
@@ -8725,7 +8825,6 @@
     </w:p>
     <w:p>
       <w:pPr>
-        <m:rPr/>
         <w:rPr>
           <w:rFonts w:hint="eastAsia" w:asciiTheme="minorEastAsia" w:hAnsiTheme="minorEastAsia" w:eastAsiaTheme="minorEastAsia" w:cstheme="minorEastAsia"/>
           <w:i w:val="0"/>
@@ -8738,7 +8837,6 @@
     </w:p>
     <w:p>
       <w:pPr>
-        <m:rPr/>
         <w:rPr>
           <w:rFonts w:hint="eastAsia" w:asciiTheme="minorEastAsia" w:hAnsiTheme="minorEastAsia" w:eastAsiaTheme="minorEastAsia" w:cstheme="minorEastAsia"/>
           <w:i w:val="0"/>
@@ -8749,7 +8847,6 @@
         </w:rPr>
       </w:pPr>
       <w:r>
-        <m:rPr/>
         <w:rPr>
           <w:rFonts w:hint="eastAsia" w:asciiTheme="minorEastAsia" w:hAnsiTheme="minorEastAsia" w:eastAsiaTheme="minorEastAsia" w:cstheme="minorEastAsia"/>
           <w:i w:val="0"/>
@@ -8758,12 +8855,35 @@
           <w:szCs w:val="24"/>
           <w:lang w:val="en-US"/>
         </w:rPr>
-        <w:t>2.3 Standard Deviation</w:t>
+        <w:t>2.</w:t>
+      </w:r>
+      <w:r>
+        <w:rPr>
+          <w:rFonts w:hint="default" w:asciiTheme="minorEastAsia" w:hAnsiTheme="minorEastAsia" w:cstheme="minorEastAsia"/>
+          <w:i w:val="0"/>
+          <w:iCs w:val="0"/>
+          <w:sz w:val="24"/>
+          <w:szCs w:val="24"/>
+          <w:lang w:val="en-US"/>
+        </w:rPr>
+        <w:t>4</w:t>
+      </w:r>
+      <w:bookmarkStart w:id="0" w:name="_GoBack"/>
+      <w:bookmarkEnd w:id="0"/>
+      <w:r>
+        <w:rPr>
+          <w:rFonts w:hint="eastAsia" w:asciiTheme="minorEastAsia" w:hAnsiTheme="minorEastAsia" w:eastAsiaTheme="minorEastAsia" w:cstheme="minorEastAsia"/>
+          <w:i w:val="0"/>
+          <w:iCs w:val="0"/>
+          <w:sz w:val="24"/>
+          <w:szCs w:val="24"/>
+          <w:lang w:val="en-US"/>
+        </w:rPr>
+        <w:t xml:space="preserve"> Standard Deviation</w:t>
       </w:r>
     </w:p>
     <w:p>
       <w:pPr>
-        <m:rPr/>
         <w:rPr>
           <w:rFonts w:hint="eastAsia" w:asciiTheme="minorEastAsia" w:hAnsiTheme="minorEastAsia" w:eastAsiaTheme="minorEastAsia" w:cstheme="minorEastAsia"/>
           <w:i w:val="0"/>
@@ -8776,7 +8896,6 @@
     </w:p>
     <w:p>
       <w:pPr>
-        <m:rPr/>
         <w:rPr>
           <w:rFonts w:hint="eastAsia" w:asciiTheme="minorEastAsia" w:hAnsiTheme="minorEastAsia" w:eastAsiaTheme="minorEastAsia" w:cstheme="minorEastAsia"/>
           <w:i w:val="0"/>
@@ -9853,7 +9972,6 @@
                 <m:radPr>
                   <m:degHide m:val="1"/>
                   <m:ctrlPr>
-                    <m:rPr/>
                     <w:rPr>
                       <w:rFonts w:hint="eastAsia" w:ascii="DejaVu Math TeX Gyre" w:hAnsi="DejaVu Math TeX Gyre" w:eastAsiaTheme="minorEastAsia" w:cstheme="minorEastAsia"/>
                       <w:i/>
@@ -9866,7 +9984,6 @@
                 </m:radPr>
                 <m:deg>
                   <m:ctrlPr>
-                    <m:rPr/>
                     <w:rPr>
                       <w:rFonts w:hint="eastAsia" w:ascii="DejaVu Math TeX Gyre" w:hAnsi="DejaVu Math TeX Gyre" w:eastAsiaTheme="minorEastAsia" w:cstheme="minorEastAsia"/>
                       <w:i/>
@@ -9881,7 +9998,6 @@
                   <m:f>
                     <m:fPr>
                       <m:ctrlPr>
-                        <m:rPr/>
                         <w:rPr>
                           <w:rFonts w:hint="eastAsia" w:ascii="DejaVu Math TeX Gyre" w:hAnsi="DejaVu Math TeX Gyre" w:eastAsiaTheme="minorEastAsia" w:cstheme="minorEastAsia"/>
                           <w:i/>
@@ -9896,7 +10012,6 @@
                       <m:f>
                         <m:fPr>
                           <m:ctrlPr>
-                            <m:rPr/>
                             <w:rPr>
                               <w:rFonts w:hint="eastAsia" w:ascii="DejaVu Math TeX Gyre" w:hAnsi="DejaVu Math TeX Gyre" w:eastAsiaTheme="minorEastAsia" w:cstheme="minorEastAsia"/>
                               <w:i/>
@@ -9919,7 +10034,6 @@
                             <m:t>1</m:t>
                           </m:r>
                           <m:ctrlPr>
-                            <m:rPr/>
                             <w:rPr>
                               <w:rFonts w:hint="eastAsia" w:ascii="DejaVu Math TeX Gyre" w:hAnsi="DejaVu Math TeX Gyre" w:eastAsiaTheme="minorEastAsia" w:cstheme="minorEastAsia"/>
                               <w:i/>
@@ -9934,7 +10048,6 @@
                           <m:sSup>
                             <m:sSupPr>
                               <m:ctrlPr>
-                                <m:rPr/>
                                 <w:rPr>
                                   <w:rFonts w:hint="eastAsia" w:ascii="DejaVu Math TeX Gyre" w:hAnsi="DejaVu Math TeX Gyre" w:eastAsiaTheme="minorEastAsia" w:cstheme="minorEastAsia"/>
                                   <w:i/>
@@ -9957,7 +10070,6 @@
                                 <m:t>s</m:t>
                               </m:r>
                               <m:ctrlPr>
-                                <m:rPr/>
                                 <w:rPr>
                                   <w:rFonts w:hint="eastAsia" w:ascii="DejaVu Math TeX Gyre" w:hAnsi="DejaVu Math TeX Gyre" w:eastAsiaTheme="minorEastAsia" w:cstheme="minorEastAsia"/>
                                   <w:i/>
@@ -9980,7 +10092,6 @@
                                 <m:t>2</m:t>
                               </m:r>
                               <m:ctrlPr>
-                                <m:rPr/>
                                 <w:rPr>
                                   <w:rFonts w:hint="eastAsia" w:ascii="DejaVu Math TeX Gyre" w:hAnsi="DejaVu Math TeX Gyre" w:eastAsiaTheme="minorEastAsia" w:cstheme="minorEastAsia"/>
                                   <w:i/>
@@ -9993,7 +10104,6 @@
                             </m:sup>
                           </m:sSup>
                           <m:ctrlPr>
-                            <m:rPr/>
                             <w:rPr>
                               <w:rFonts w:hint="eastAsia" w:ascii="DejaVu Math TeX Gyre" w:hAnsi="DejaVu Math TeX Gyre" w:eastAsiaTheme="minorEastAsia" w:cstheme="minorEastAsia"/>
                               <w:i/>
@@ -10010,7 +10120,6 @@
                           <m:begChr m:val="["/>
                           <m:endChr m:val="]"/>
                           <m:ctrlPr>
-                            <m:rPr/>
                             <w:rPr>
                               <w:rFonts w:hint="eastAsia" w:ascii="DejaVu Math TeX Gyre" w:hAnsi="DejaVu Math TeX Gyre" w:eastAsiaTheme="minorEastAsia" w:cstheme="minorEastAsia"/>
                               <w:i/>
@@ -10025,7 +10134,6 @@
                           <m:sSup>
                             <m:sSupPr>
                               <m:ctrlPr>
-                                <m:rPr/>
                                 <w:rPr>
                                   <w:rFonts w:hint="eastAsia" w:ascii="DejaVu Math TeX Gyre" w:hAnsi="DejaVu Math TeX Gyre" w:eastAsiaTheme="minorEastAsia" w:cstheme="minorEastAsia"/>
                                   <w:i/>
@@ -10163,7 +10271,6 @@
                                 <m:t>)</m:t>
                               </m:r>
                               <m:ctrlPr>
-                                <m:rPr/>
                                 <w:rPr>
                                   <w:rFonts w:hint="eastAsia" w:ascii="DejaVu Math TeX Gyre" w:hAnsi="DejaVu Math TeX Gyre" w:eastAsiaTheme="minorEastAsia" w:cstheme="minorEastAsia"/>
                                   <w:i/>
@@ -10186,7 +10293,6 @@
                                 <m:t>2</m:t>
                               </m:r>
                               <m:ctrlPr>
-                                <m:rPr/>
                                 <w:rPr>
                                   <w:rFonts w:hint="eastAsia" w:ascii="DejaVu Math TeX Gyre" w:hAnsi="DejaVu Math TeX Gyre" w:eastAsiaTheme="minorEastAsia" w:cstheme="minorEastAsia"/>
                                   <w:i/>
@@ -10748,7 +10854,6 @@
                             </m:sup>
                           </m:sSup>
                           <m:ctrlPr>
-                            <m:rPr/>
                             <w:rPr>
                               <w:rFonts w:hint="eastAsia" w:ascii="DejaVu Math TeX Gyre" w:hAnsi="DejaVu Math TeX Gyre" w:eastAsiaTheme="minorEastAsia" w:cstheme="minorEastAsia"/>
                               <w:i/>
@@ -10761,7 +10866,6 @@
                         </m:e>
                       </m:d>
                       <m:ctrlPr>
-                        <m:rPr/>
                         <w:rPr>
                           <w:rFonts w:hint="eastAsia" w:ascii="DejaVu Math TeX Gyre" w:hAnsi="DejaVu Math TeX Gyre" w:eastAsiaTheme="minorEastAsia" w:cstheme="minorEastAsia"/>
                           <w:i/>
@@ -10784,7 +10888,6 @@
                         <m:t>n−1</m:t>
                       </m:r>
                       <m:ctrlPr>
-                        <m:rPr/>
                         <w:rPr>
                           <w:rFonts w:hint="eastAsia" w:ascii="DejaVu Math TeX Gyre" w:hAnsi="DejaVu Math TeX Gyre" w:eastAsiaTheme="minorEastAsia" w:cstheme="minorEastAsia"/>
                           <w:i/>
@@ -10797,7 +10900,6 @@
                     </m:den>
                   </m:f>
                   <m:ctrlPr>
-                    <m:rPr/>
                     <w:rPr>
                       <w:rFonts w:hint="eastAsia" w:ascii="DejaVu Math TeX Gyre" w:hAnsi="DejaVu Math TeX Gyre" w:eastAsiaTheme="minorEastAsia" w:cstheme="minorEastAsia"/>
                       <w:i/>
@@ -11875,7 +11977,6 @@
         </m:m>
       </m:oMath>
       <w:r>
-        <m:rPr/>
         <w:rPr>
           <w:rFonts w:hint="eastAsia" w:asciiTheme="minorEastAsia" w:hAnsiTheme="minorEastAsia" w:eastAsiaTheme="minorEastAsia" w:cstheme="minorEastAsia"/>
           <w:i w:val="0"/>

</xml_diff>

<commit_message>
Sync from private source SHA: 81a6e87ba682c15327d9b213be2022e79243c395
</commit_message>
<xml_diff>
--- a/Docs/01Foundation/Normal Distribution.docx
+++ b/Docs/01Foundation/Normal Distribution.docx
@@ -4800,7 +4800,7 @@
           <w:szCs w:val="24"/>
           <w:lang w:val="en-US" w:eastAsia="zh-CN" w:bidi="ar-SA"/>
         </w:rPr>
-        <w:t>Appendix Derivation:</w:t>
+        <w:t>Appendix Derivation</w:t>
       </w:r>
     </w:p>
     <w:p>
@@ -8684,12 +8684,12 @@
                     <m:r>
                       <m:rPr/>
                       <w:rPr>
-                        <w:rFonts w:hint="eastAsia" w:ascii="DejaVu Math TeX Gyre" w:hAnsi="DejaVu Math TeX Gyre" w:eastAsiaTheme="minorEastAsia" w:cstheme="minorEastAsia"/>
+                        <w:rFonts w:hint="default" w:ascii="DejaVu Math TeX Gyre" w:hAnsi="DejaVu Math TeX Gyre" w:cstheme="minorEastAsia"/>
                         <w:sz w:val="24"/>
                         <w:szCs w:val="24"/>
                         <w:lang w:val="en-US"/>
                       </w:rPr>
-                      <m:t>x</m:t>
+                      <m:t>s</m:t>
                     </m:r>
                     <m:ctrlPr>
                       <w:rPr>
@@ -8834,6 +8834,8 @@
           <w:lang w:val="en-US"/>
         </w:rPr>
       </w:pPr>
+      <w:bookmarkStart w:id="0" w:name="_GoBack"/>
+      <w:bookmarkEnd w:id="0"/>
     </w:p>
     <w:p>
       <w:pPr>
@@ -8868,8 +8870,6 @@
         </w:rPr>
         <w:t>4</w:t>
       </w:r>
-      <w:bookmarkStart w:id="0" w:name="_GoBack"/>
-      <w:bookmarkEnd w:id="0"/>
       <w:r>
         <w:rPr>
           <w:rFonts w:hint="eastAsia" w:asciiTheme="minorEastAsia" w:hAnsiTheme="minorEastAsia" w:eastAsiaTheme="minorEastAsia" w:cstheme="minorEastAsia"/>

</xml_diff>

<commit_message>
Sync from private source SHA: e8ca51c2ff1adc37781c78277222c3c60ef6f342
</commit_message>
<xml_diff>
--- a/Docs/01Foundation/Normal Distribution.docx
+++ b/Docs/01Foundation/Normal Distribution.docx
@@ -4779,18 +4779,7 @@
         <w:textAlignment w:val="auto"/>
         <w:outlineLvl w:val="0"/>
         <w:rPr>
-          <w:rFonts w:hint="default" w:asciiTheme="minorEastAsia" w:hAnsiTheme="minorEastAsia" w:eastAsiaTheme="minorEastAsia" w:cstheme="minorEastAsia"/>
-          <w:i w:val="0"/>
-          <w:iCs w:val="0"/>
-          <w:kern w:val="2"/>
-          <w:sz w:val="24"/>
-          <w:szCs w:val="24"/>
-          <w:lang w:val="en-US" w:eastAsia="zh-CN" w:bidi="ar-SA"/>
-        </w:rPr>
-      </w:pPr>
-      <w:r>
-        <w:rPr>
-          <w:rFonts w:hint="default" w:asciiTheme="minorEastAsia" w:hAnsiTheme="minorEastAsia" w:cstheme="minorEastAsia"/>
+          <w:rFonts w:hint="eastAsia" w:asciiTheme="minorEastAsia" w:hAnsiTheme="minorEastAsia" w:eastAsiaTheme="minorEastAsia" w:cstheme="minorEastAsia"/>
           <w:b/>
           <w:bCs/>
           <w:i w:val="0"/>
@@ -4800,7 +4789,20 @@
           <w:szCs w:val="24"/>
           <w:lang w:val="en-US" w:eastAsia="zh-CN" w:bidi="ar-SA"/>
         </w:rPr>
-        <w:t>Appendix Derivation</w:t>
+      </w:pPr>
+      <w:r>
+        <w:rPr>
+          <w:rFonts w:hint="eastAsia" w:asciiTheme="minorEastAsia" w:hAnsiTheme="minorEastAsia" w:eastAsiaTheme="minorEastAsia" w:cstheme="minorEastAsia"/>
+          <w:b/>
+          <w:bCs/>
+          <w:i w:val="0"/>
+          <w:iCs w:val="0"/>
+          <w:kern w:val="2"/>
+          <w:sz w:val="24"/>
+          <w:szCs w:val="24"/>
+          <w:lang w:val="en-US" w:eastAsia="zh-CN" w:bidi="ar-SA"/>
+        </w:rPr>
+        <w:t>AppendixⅠ</w:t>
       </w:r>
     </w:p>
     <w:p>
@@ -4820,6 +4822,7 @@
         <w:snapToGrid/>
         <w:spacing w:line="360" w:lineRule="auto"/>
         <w:textAlignment w:val="auto"/>
+        <w:outlineLvl w:val="9"/>
         <w:rPr>
           <w:rFonts w:hint="default" w:asciiTheme="minorEastAsia" w:hAnsiTheme="minorEastAsia" w:cstheme="minorEastAsia"/>
           <w:i w:val="0"/>
@@ -5029,7 +5032,7 @@
           <w:vertAlign w:val="baseline"/>
           <w:lang w:val="en-US"/>
         </w:rPr>
-        <w:t xml:space="preserve"> ; </w:t>
+        <w:t xml:space="preserve"> </w:t>
       </w:r>
     </w:p>
     <w:p>
@@ -7982,6 +7985,16 @@
                         <m:r>
                           <m:rPr/>
                           <w:rPr>
+                            <w:rFonts w:hint="default" w:ascii="DejaVu Math TeX Gyre" w:hAnsi="DejaVu Math TeX Gyre" w:cstheme="minorEastAsia"/>
+                            <w:sz w:val="24"/>
+                            <w:szCs w:val="24"/>
+                            <w:lang w:val="en-US"/>
+                          </w:rPr>
+                          <m:t>+</m:t>
+                        </m:r>
+                        <m:r>
+                          <m:rPr/>
+                          <w:rPr>
                             <w:rFonts w:hint="eastAsia" w:ascii="DejaVu Math TeX Gyre" w:hAnsi="DejaVu Math TeX Gyre" w:eastAsiaTheme="minorEastAsia" w:cstheme="minorEastAsia"/>
                             <w:sz w:val="24"/>
                             <w:szCs w:val="24"/>
@@ -8417,6 +8430,16 @@
                         <m:r>
                           <m:rPr/>
                           <w:rPr>
+                            <w:rFonts w:hint="default" w:ascii="DejaVu Math TeX Gyre" w:hAnsi="DejaVu Math TeX Gyre" w:cstheme="minorEastAsia"/>
+                            <w:sz w:val="24"/>
+                            <w:szCs w:val="24"/>
+                            <w:lang w:val="en-US"/>
+                          </w:rPr>
+                          <m:t>+</m:t>
+                        </m:r>
+                        <m:r>
+                          <m:rPr/>
+                          <w:rPr>
                             <w:rFonts w:hint="eastAsia" w:ascii="DejaVu Math TeX Gyre" w:hAnsi="DejaVu Math TeX Gyre" w:eastAsiaTheme="minorEastAsia" w:cstheme="minorEastAsia"/>
                             <w:sz w:val="24"/>
                             <w:szCs w:val="24"/>
@@ -8834,8 +8857,6 @@
           <w:lang w:val="en-US"/>
         </w:rPr>
       </w:pPr>
-      <w:bookmarkStart w:id="0" w:name="_GoBack"/>
-      <w:bookmarkEnd w:id="0"/>
     </w:p>
     <w:p>
       <w:pPr>
@@ -8881,6 +8902,8 @@
         </w:rPr>
         <w:t xml:space="preserve"> Standard Deviation</w:t>
       </w:r>
+      <w:bookmarkStart w:id="0" w:name="_GoBack"/>
+      <w:bookmarkEnd w:id="0"/>
     </w:p>
     <w:p>
       <w:pPr>
@@ -11894,64 +11917,16 @@
                 </w:rPr>
                 <m:t xml:space="preserve"> × </m:t>
               </m:r>
-              <m:f>
-                <m:fPr>
-                  <m:ctrlPr>
-                    <w:rPr>
-                      <w:rFonts w:hint="eastAsia" w:ascii="DejaVu Math TeX Gyre" w:hAnsi="DejaVu Math TeX Gyre" w:eastAsiaTheme="minorEastAsia" w:cstheme="minorEastAsia"/>
-                      <w:i/>
-                      <w:iCs w:val="0"/>
-                      <w:sz w:val="24"/>
-                      <w:szCs w:val="24"/>
-                      <w:lang w:val="en-US"/>
-                    </w:rPr>
-                  </m:ctrlPr>
-                </m:fPr>
-                <m:num>
-                  <m:r>
-                    <m:rPr/>
-                    <w:rPr>
-                      <w:rFonts w:hint="eastAsia" w:ascii="DejaVu Math TeX Gyre" w:hAnsi="DejaVu Math TeX Gyre" w:eastAsiaTheme="minorEastAsia" w:cstheme="minorEastAsia"/>
-                      <w:sz w:val="24"/>
-                      <w:szCs w:val="24"/>
-                      <w:lang w:val="en-US"/>
-                    </w:rPr>
-                    <m:t>1</m:t>
-                  </m:r>
-                  <m:ctrlPr>
-                    <w:rPr>
-                      <w:rFonts w:hint="eastAsia" w:ascii="DejaVu Math TeX Gyre" w:hAnsi="DejaVu Math TeX Gyre" w:eastAsiaTheme="minorEastAsia" w:cstheme="minorEastAsia"/>
-                      <w:i/>
-                      <w:iCs w:val="0"/>
-                      <w:sz w:val="24"/>
-                      <w:szCs w:val="24"/>
-                      <w:lang w:val="en-US"/>
-                    </w:rPr>
-                  </m:ctrlPr>
-                </m:num>
-                <m:den>
-                  <m:r>
-                    <m:rPr/>
-                    <w:rPr>
-                      <w:rFonts w:hint="eastAsia" w:ascii="DejaVu Math TeX Gyre" w:hAnsi="DejaVu Math TeX Gyre" w:eastAsiaTheme="minorEastAsia" w:cstheme="minorEastAsia"/>
-                      <w:sz w:val="24"/>
-                      <w:szCs w:val="24"/>
-                      <w:lang w:val="en-US"/>
-                    </w:rPr>
-                    <m:t>s</m:t>
-                  </m:r>
-                  <m:ctrlPr>
-                    <w:rPr>
-                      <w:rFonts w:hint="eastAsia" w:ascii="DejaVu Math TeX Gyre" w:hAnsi="DejaVu Math TeX Gyre" w:eastAsiaTheme="minorEastAsia" w:cstheme="minorEastAsia"/>
-                      <w:i/>
-                      <w:iCs w:val="0"/>
-                      <w:sz w:val="24"/>
-                      <w:szCs w:val="24"/>
-                      <w:lang w:val="en-US"/>
-                    </w:rPr>
-                  </m:ctrlPr>
-                </m:den>
-              </m:f>
+              <m:r>
+                <m:rPr/>
+                <w:rPr>
+                  <w:rFonts w:hint="default" w:ascii="DejaVu Math TeX Gyre" w:hAnsi="DejaVu Math TeX Gyre" w:cstheme="minorEastAsia"/>
+                  <w:sz w:val="24"/>
+                  <w:szCs w:val="24"/>
+                  <w:lang w:val="en-US"/>
+                </w:rPr>
+                <m:t>s</m:t>
+              </m:r>
               <m:r>
                 <m:rPr/>
                 <w:rPr>
@@ -12007,7 +11982,7 @@
         <w:textAlignment w:val="auto"/>
         <w:outlineLvl w:val="0"/>
         <w:rPr>
-          <w:rFonts w:hint="default" w:asciiTheme="minorEastAsia" w:hAnsiTheme="minorEastAsia" w:cstheme="minorEastAsia"/>
+          <w:rFonts w:hint="eastAsia" w:asciiTheme="minorEastAsia" w:hAnsiTheme="minorEastAsia" w:eastAsiaTheme="minorEastAsia" w:cstheme="minorEastAsia"/>
           <w:b/>
           <w:bCs/>
           <w:i w:val="0"/>
@@ -12019,7 +11994,7 @@
       </w:pPr>
       <w:r>
         <w:rPr>
-          <w:rFonts w:hint="default" w:asciiTheme="minorEastAsia" w:hAnsiTheme="minorEastAsia" w:cstheme="minorEastAsia"/>
+          <w:rFonts w:hint="eastAsia" w:asciiTheme="minorEastAsia" w:hAnsiTheme="minorEastAsia" w:eastAsiaTheme="minorEastAsia" w:cstheme="minorEastAsia"/>
           <w:b/>
           <w:bCs/>
           <w:i w:val="0"/>
@@ -12028,7 +12003,7 @@
           <w:szCs w:val="24"/>
           <w:lang w:val="en-US"/>
         </w:rPr>
-        <w:t>Appendix</w:t>
+        <w:t>AppendixⅡ</w:t>
       </w:r>
     </w:p>
     <w:p>

</xml_diff>